<commit_message>
feat: tailor multilingual resumes and chat language
</commit_message>
<xml_diff>
--- a/public/resume-en.docx
+++ b/public/resume-en.docx
@@ -87,7 +87,7 @@
                                 <w:sz w:val="56"/>
                                 <w:szCs w:val="56"/>
                               </w:rPr>
-                              <w:t>个人简历</w:t>
+                              <w:t>Resume</w:t>
                             </w:r>
                           </w:p>
                         </w:txbxContent>
@@ -121,7 +121,7 @@
                           <w:sz w:val="56"/>
                           <w:szCs w:val="56"/>
                         </w:rPr>
-                        <w:t>个人简历</w:t>
+                        <w:t>Resume</w:t>
                       </w:r>
                     </w:p>
                   </w:txbxContent>
@@ -291,7 +291,7 @@
                                 <w:bCs/>
                                 <w:color w:val="404040" w:themeColor="text1" w:themeTint="BF"/>
                               </w:rPr>
-                              <w:t xml:space="preserve">姓    </w:t>
+                              <w:t xml:space="preserve">First</w:t>
                             </w:r>
                             <w:r>
                               <w:rPr>
@@ -300,7 +300,7 @@
                                 <w:bCs/>
                                 <w:color w:val="404040" w:themeColor="text1" w:themeTint="BF"/>
                               </w:rPr>
-                              <w:t>名</w:t>
+                              <w:t>Name</w:t>
                             </w:r>
                           </w:p>
                           <w:p>
@@ -319,7 +319,7 @@
                                 <w:bCs/>
                                 <w:color w:val="404040" w:themeColor="text1" w:themeTint="BF"/>
                               </w:rPr>
-                              <w:t>民    族</w:t>
+                              <w:t>Ethnicity</w:t>
                             </w:r>
                           </w:p>
                           <w:p>
@@ -338,7 +338,7 @@
                                 <w:bCs/>
                                 <w:color w:val="404040" w:themeColor="text1" w:themeTint="BF"/>
                               </w:rPr>
-                              <w:t>电    话</w:t>
+                              <w:t>Phone</w:t>
                             </w:r>
                           </w:p>
                           <w:p>
@@ -357,7 +357,7 @@
                                 <w:bCs/>
                                 <w:color w:val="404040" w:themeColor="text1" w:themeTint="BF"/>
                               </w:rPr>
-                              <w:t>邮    箱</w:t>
+                              <w:t>Email</w:t>
                             </w:r>
                           </w:p>
                           <w:p>
@@ -406,7 +406,7 @@
                           <w:bCs/>
                           <w:color w:val="404040" w:themeColor="text1" w:themeTint="BF"/>
                         </w:rPr>
-                        <w:t xml:space="preserve">姓    </w:t>
+                        <w:t xml:space="preserve">First</w:t>
                       </w:r>
                       <w:r>
                         <w:rPr>
@@ -415,7 +415,7 @@
                           <w:bCs/>
                           <w:color w:val="404040" w:themeColor="text1" w:themeTint="BF"/>
                         </w:rPr>
-                        <w:t>名</w:t>
+                        <w:t>Name</w:t>
                       </w:r>
                     </w:p>
                     <w:p>
@@ -434,7 +434,7 @@
                           <w:bCs/>
                           <w:color w:val="404040" w:themeColor="text1" w:themeTint="BF"/>
                         </w:rPr>
-                        <w:t>民    族</w:t>
+                        <w:t>Ethnicity</w:t>
                       </w:r>
                     </w:p>
                     <w:p>
@@ -453,7 +453,7 @@
                           <w:bCs/>
                           <w:color w:val="404040" w:themeColor="text1" w:themeTint="BF"/>
                         </w:rPr>
-                        <w:t>电    话</w:t>
+                        <w:t>Phone</w:t>
                       </w:r>
                     </w:p>
                     <w:p>
@@ -472,7 +472,7 @@
                           <w:bCs/>
                           <w:color w:val="404040" w:themeColor="text1" w:themeTint="BF"/>
                         </w:rPr>
-                        <w:t>邮    箱</w:t>
+                        <w:t>Email</w:t>
                       </w:r>
                     </w:p>
                     <w:p>
@@ -562,7 +562,7 @@
                                 <w:bCs/>
                                 <w:color w:val="404040" w:themeColor="text1" w:themeTint="BF"/>
                               </w:rPr>
-                              <w:t xml:space="preserve">年 </w:t>
+                              <w:t xml:space="preserve">Age</w:t>
                             </w:r>
                             <w:r>
                               <w:rPr>
@@ -571,7 +571,7 @@
                                 <w:bCs/>
                                 <w:color w:val="404040" w:themeColor="text1" w:themeTint="BF"/>
                               </w:rPr>
-                              <w:t xml:space="preserve">   </w:t>
+                              <w:t xml:space="preserve"/>
                             </w:r>
                             <w:r>
                               <w:rPr>
@@ -580,7 +580,7 @@
                                 <w:bCs/>
                                 <w:color w:val="404040" w:themeColor="text1" w:themeTint="BF"/>
                               </w:rPr>
-                              <w:t>龄</w:t>
+                              <w:t>Age</w:t>
                             </w:r>
                           </w:p>
                           <w:p>
@@ -599,7 +599,7 @@
                                 <w:bCs/>
                                 <w:color w:val="404040" w:themeColor="text1" w:themeTint="BF"/>
                               </w:rPr>
-                              <w:t>政治面貌毕业院校</w:t>
+                              <w:t>Status / University</w:t>
                             </w:r>
                           </w:p>
                           <w:p>
@@ -618,7 +618,7 @@
                                 <w:bCs/>
                                 <w:color w:val="404040" w:themeColor="text1" w:themeTint="BF"/>
                               </w:rPr>
-                              <w:t>学    历</w:t>
+                              <w:t>Education</w:t>
                             </w:r>
                           </w:p>
                         </w:txbxContent>
@@ -653,7 +653,7 @@
                           <w:bCs/>
                           <w:color w:val="404040" w:themeColor="text1" w:themeTint="BF"/>
                         </w:rPr>
-                        <w:t xml:space="preserve">年 </w:t>
+                        <w:t xml:space="preserve">Age</w:t>
                       </w:r>
                       <w:r>
                         <w:rPr>
@@ -662,7 +662,7 @@
                           <w:bCs/>
                           <w:color w:val="404040" w:themeColor="text1" w:themeTint="BF"/>
                         </w:rPr>
-                        <w:t xml:space="preserve">   </w:t>
+                        <w:t xml:space="preserve"/>
                       </w:r>
                       <w:r>
                         <w:rPr>
@@ -671,7 +671,7 @@
                           <w:bCs/>
                           <w:color w:val="404040" w:themeColor="text1" w:themeTint="BF"/>
                         </w:rPr>
-                        <w:t>龄</w:t>
+                        <w:t>Age</w:t>
                       </w:r>
                     </w:p>
                     <w:p>
@@ -690,7 +690,7 @@
                           <w:bCs/>
                           <w:color w:val="404040" w:themeColor="text1" w:themeTint="BF"/>
                         </w:rPr>
-                        <w:t>政治面貌毕业院校</w:t>
+                        <w:t>Status / University</w:t>
                       </w:r>
                     </w:p>
                     <w:p>
@@ -709,7 +709,7 @@
                           <w:bCs/>
                           <w:color w:val="404040" w:themeColor="text1" w:themeTint="BF"/>
                         </w:rPr>
-                        <w:t>学    历</w:t>
+                        <w:t>Education</w:t>
                       </w:r>
                     </w:p>
                   </w:txbxContent>
@@ -788,14 +788,14 @@
                                 <w:rFonts w:ascii="微软雅黑" w:eastAsia="微软雅黑" w:hAnsi="微软雅黑"/>
                                 <w:color w:val="404040" w:themeColor="text1" w:themeTint="BF"/>
                               </w:rPr>
-                              <w:t>蔡</w:t>
+                              <w:t>Cai</w:t>
                             </w:r>
                             <w:r>
                               <w:rPr>
                                 <w:rFonts w:ascii="微软雅黑" w:eastAsia="微软雅黑" w:hAnsi="微软雅黑" w:hint="eastAsia"/>
                                 <w:color w:val="404040" w:themeColor="text1" w:themeTint="BF"/>
                               </w:rPr>
-                              <w:t>宙廷</w:t>
+                              <w:t>Zhouting</w:t>
                             </w:r>
                           </w:p>
                           <w:p>
@@ -813,7 +813,7 @@
                                 <w:rFonts w:ascii="微软雅黑" w:eastAsia="微软雅黑" w:hAnsi="微软雅黑" w:hint="eastAsia"/>
                                 <w:color w:val="404040" w:themeColor="text1" w:themeTint="BF"/>
                               </w:rPr>
-                              <w:t>汉</w:t>
+                              <w:t>Chinese</w:t>
                             </w:r>
                           </w:p>
                           <w:p>
@@ -894,14 +894,14 @@
                           <w:rFonts w:ascii="微软雅黑" w:eastAsia="微软雅黑" w:hAnsi="微软雅黑"/>
                           <w:color w:val="404040" w:themeColor="text1" w:themeTint="BF"/>
                         </w:rPr>
-                        <w:t>蔡</w:t>
+                        <w:t>Cai</w:t>
                       </w:r>
                       <w:r>
                         <w:rPr>
                           <w:rFonts w:ascii="微软雅黑" w:eastAsia="微软雅黑" w:hAnsi="微软雅黑" w:hint="eastAsia"/>
                           <w:color w:val="404040" w:themeColor="text1" w:themeTint="BF"/>
                         </w:rPr>
-                        <w:t>宙廷</w:t>
+                        <w:t>Zhouting</w:t>
                       </w:r>
                     </w:p>
                     <w:p>
@@ -919,7 +919,7 @@
                           <w:rFonts w:ascii="微软雅黑" w:eastAsia="微软雅黑" w:hAnsi="微软雅黑" w:hint="eastAsia"/>
                           <w:color w:val="404040" w:themeColor="text1" w:themeTint="BF"/>
                         </w:rPr>
-                        <w:t>汉</w:t>
+                        <w:t>Chinese</w:t>
                       </w:r>
                     </w:p>
                     <w:p>
@@ -1043,7 +1043,7 @@
                                   </w14:srgbClr>
                                 </w14:shadow>
                               </w:rPr>
-                              <w:t>个人简历</w:t>
+                              <w:t>Resume</w:t>
                             </w:r>
                           </w:p>
                         </w:txbxContent>
@@ -1075,7 +1075,7 @@
                             </w14:srgbClr>
                           </w14:shadow>
                         </w:rPr>
-                        <w:t>个人简历</w:t>
+                        <w:t>Resume</w:t>
                       </w:r>
                     </w:p>
                   </w:txbxContent>
@@ -1090,7 +1090,7 @@
           <w:rFonts w:hint="eastAsia"/>
           <w:sz w:val="28"/>
         </w:rPr>
-        <w:t xml:space="preserve"> </w:t>
+        <w:t xml:space="preserve"/>
       </w:r>
     </w:p>
     <w:p>
@@ -1182,7 +1182,7 @@
                                 <w:color w:val="404040" w:themeColor="text1" w:themeTint="BF"/>
                                 <w:sz w:val="22"/>
                               </w:rPr>
-                              <w:t>做出成绩的同时不断共享跟进流程为整个团队赋能，提高整体效率和利润</w:t>
+                              <w:t>AI product development | Cross-border e-commerce | Workflow engineering</w:t>
                             </w:r>
                           </w:p>
                           <w:p>
@@ -1211,7 +1211,7 @@
                                 <w:sz w:val="20"/>
                                 <w:szCs w:val="20"/>
                               </w:rPr>
-                              <w:t>开品速度：约为同事2倍，每月精铺8个品以上</w:t>
+                              <w:t>Launch velocity: ~2x peers | 8+ products/month</w:t>
                             </w:r>
                           </w:p>
                           <w:p>
@@ -1240,7 +1240,7 @@
                                 <w:sz w:val="20"/>
                                 <w:szCs w:val="20"/>
                               </w:rPr>
-                              <w:t>做图效率：30分钟/套</w:t>
+                              <w:t>Creative throughput: 30 min/set</w:t>
                             </w:r>
                           </w:p>
                           <w:p>
@@ -1266,7 +1266,7 @@
                                 <w:sz w:val="20"/>
                                 <w:szCs w:val="20"/>
                               </w:rPr>
-                              <w:t>设计优化：3名设计师</w:t>
+                              <w:t>Capacity optimized: 3 designers</w:t>
                             </w:r>
                           </w:p>
                           <w:p>
@@ -1292,7 +1292,7 @@
                                 <w:sz w:val="20"/>
                                 <w:szCs w:val="20"/>
                               </w:rPr>
-                              <w:t>利润结果：月度利润贡献≥2万元，最高时选品产生利润一度超过10万元，所选品持续不亏损</w:t>
+                              <w:t>Business impact: &gt;= RMB 20K monthly gross-profit contribution; assigned products remained profitable</w:t>
                             </w:r>
                           </w:p>
                         </w:txbxContent>
@@ -1334,7 +1334,7 @@
                           <w:color w:val="404040" w:themeColor="text1" w:themeTint="BF"/>
                           <w:sz w:val="22"/>
                         </w:rPr>
-                        <w:t>做出成绩的同时不断共享跟进流程为整个团队赋能，提高整体效率和利润</w:t>
+                        <w:t>AI product development | Cross-border e-commerce | Workflow engineering</w:t>
                       </w:r>
                     </w:p>
                     <w:p>
@@ -1363,7 +1363,7 @@
                           <w:sz w:val="20"/>
                           <w:szCs w:val="20"/>
                         </w:rPr>
-                        <w:t>开品速度：约为同事2倍，每月精铺8个品以上</w:t>
+                        <w:t>Launch velocity: ~2x peers | 8+ products/month</w:t>
                       </w:r>
                     </w:p>
                     <w:p>
@@ -1392,7 +1392,7 @@
                           <w:sz w:val="20"/>
                           <w:szCs w:val="20"/>
                         </w:rPr>
-                        <w:t>做图效率：30分钟/套</w:t>
+                        <w:t>Creative throughput: 30 min/set</w:t>
                       </w:r>
                     </w:p>
                     <w:p>
@@ -1418,7 +1418,7 @@
                           <w:sz w:val="20"/>
                           <w:szCs w:val="20"/>
                         </w:rPr>
-                        <w:t>设计优化：3名设计师</w:t>
+                        <w:t>Capacity optimized: 3 designers</w:t>
                       </w:r>
                     </w:p>
                     <w:p>
@@ -1444,7 +1444,7 @@
                           <w:sz w:val="20"/>
                           <w:szCs w:val="20"/>
                         </w:rPr>
-                        <w:t>利润结果：月度利润贡献≥2万元，最高时选品产生利润一度超过10万元，所选品持续不亏损</w:t>
+                        <w:t>Business impact: &gt;= RMB 20K monthly gross-profit contribution; assigned products remained profitable</w:t>
                       </w:r>
                     </w:p>
                   </w:txbxContent>
@@ -1620,7 +1620,7 @@
                                   <w:sz w:val="28"/>
                                   <w:szCs w:val="28"/>
                                 </w:rPr>
-                                <w:t>技能证书</w:t>
+                                <w:t>Core skills</w:t>
                               </w:r>
                             </w:p>
                           </w:txbxContent>
@@ -1658,7 +1658,7 @@
                             <w:sz w:val="28"/>
                             <w:szCs w:val="28"/>
                           </w:rPr>
-                          <w:t>技能证书</w:t>
+                          <w:t>Core skills</w:t>
                         </w:r>
                       </w:p>
                     </w:txbxContent>
@@ -1747,7 +1747,7 @@
                                 <w:sz w:val="20"/>
                                 <w:szCs w:val="20"/>
                               </w:rPr>
-                              <w:t>日语N1</w:t>
+                              <w:t>Japanese N1</w:t>
                             </w:r>
                             <w:r>
                               <w:rPr>
@@ -1756,7 +1756,7 @@
                                 <w:sz w:val="20"/>
                                 <w:szCs w:val="20"/>
                               </w:rPr>
-                              <w:t>，具备日语口语、读写及商务沟通能力</w:t>
+                              <w:t>, professional spoken, written and business communication</w:t>
                             </w:r>
                           </w:p>
                           <w:p>
@@ -1784,7 +1784,7 @@
                                 <w:sz w:val="20"/>
                                 <w:szCs w:val="20"/>
                               </w:rPr>
-                              <w:t>CET-4，可快速阅读英文产品与技术资料</w:t>
+                              <w:t>CET-4; able to quickly read English product and technical materials</w:t>
                             </w:r>
                           </w:p>
                           <w:p>
@@ -1811,7 +1811,7 @@
                                 <w:sz w:val="20"/>
                                 <w:szCs w:val="20"/>
                               </w:rPr>
-                              <w:t>Python、SQL/MySQL、SPSS；AI辅助编程、数据分析与自动化</w:t>
+                              <w:t>Python, SQL/MySQL, SPSS; AI-assisted coding, analytics and automation</w:t>
                             </w:r>
                           </w:p>
                           <w:p>
@@ -1838,7 +1838,7 @@
                                 <w:sz w:val="20"/>
                                 <w:szCs w:val="20"/>
                               </w:rPr>
-                              <w:t>飞书多维表格、</w:t>
+                              <w:t>Feishu Bitable, </w:t>
                             </w:r>
                             <w:proofErr w:type="spellStart"/>
                             <w:r>
@@ -1858,7 +1858,7 @@
                                 <w:sz w:val="20"/>
                                 <w:szCs w:val="20"/>
                               </w:rPr>
-                              <w:t>、</w:t>
+                              <w:t> and </w:t>
                             </w:r>
                             <w:proofErr w:type="spellStart"/>
                             <w:r>
@@ -1878,7 +1878,7 @@
                                 <w:sz w:val="20"/>
                                 <w:szCs w:val="20"/>
                               </w:rPr>
-                              <w:t>；剪映、PS、AE</w:t>
+                              <w:t>; CapCut, Photoshop, After Effects</w:t>
                             </w:r>
                           </w:p>
                         </w:txbxContent>
@@ -1922,7 +1922,7 @@
                           <w:sz w:val="20"/>
                           <w:szCs w:val="20"/>
                         </w:rPr>
-                        <w:t>日语N1</w:t>
+                        <w:t>Japanese N1</w:t>
                       </w:r>
                       <w:r>
                         <w:rPr>
@@ -1931,7 +1931,7 @@
                           <w:sz w:val="20"/>
                           <w:szCs w:val="20"/>
                         </w:rPr>
-                        <w:t>，具备日语口语、读写及商务沟通能力</w:t>
+                        <w:t>, professional spoken, written and business communication</w:t>
                       </w:r>
                     </w:p>
                     <w:p>
@@ -1959,7 +1959,7 @@
                           <w:sz w:val="20"/>
                           <w:szCs w:val="20"/>
                         </w:rPr>
-                        <w:t>CET-4，可快速阅读英文产品与技术资料</w:t>
+                        <w:t>CET-4; able to quickly read English product and technical materials</w:t>
                       </w:r>
                     </w:p>
                     <w:p>
@@ -1986,7 +1986,7 @@
                           <w:sz w:val="20"/>
                           <w:szCs w:val="20"/>
                         </w:rPr>
-                        <w:t>Python、SQL/MySQL、SPSS；AI辅助编程、数据分析与自动化</w:t>
+                        <w:t>Python, SQL/MySQL, SPSS; AI-assisted coding, analytics and automation</w:t>
                       </w:r>
                     </w:p>
                     <w:p>
@@ -2013,7 +2013,7 @@
                           <w:sz w:val="20"/>
                           <w:szCs w:val="20"/>
                         </w:rPr>
-                        <w:t>飞书多维表格、</w:t>
+                        <w:t>Feishu Bitable, </w:t>
                       </w:r>
                       <w:proofErr w:type="spellStart"/>
                       <w:r>
@@ -2033,7 +2033,7 @@
                           <w:sz w:val="20"/>
                           <w:szCs w:val="20"/>
                         </w:rPr>
-                        <w:t>、</w:t>
+                        <w:t> and </w:t>
                       </w:r>
                       <w:proofErr w:type="spellStart"/>
                       <w:r>
@@ -2053,7 +2053,7 @@
                           <w:sz w:val="20"/>
                           <w:szCs w:val="20"/>
                         </w:rPr>
-                        <w:t>；剪映、PS、AE</w:t>
+                        <w:t>; CapCut, Photoshop, After Effects</w:t>
                       </w:r>
                     </w:p>
                   </w:txbxContent>
@@ -2229,7 +2229,7 @@
                                   <w:sz w:val="28"/>
                                   <w:szCs w:val="28"/>
                                 </w:rPr>
-                                <w:t>自我评价</w:t>
+                                <w:t>Professional summary</w:t>
                               </w:r>
                             </w:p>
                           </w:txbxContent>
@@ -2267,7 +2267,7 @@
                             <w:sz w:val="28"/>
                             <w:szCs w:val="28"/>
                           </w:rPr>
-                          <w:t>自我评价</w:t>
+                          <w:t>Professional summary</w:t>
                         </w:r>
                       </w:p>
                     </w:txbxContent>
@@ -2346,63 +2346,63 @@
                                 <w:rFonts w:ascii="微软雅黑" w:eastAsia="微软雅黑" w:hAnsi="微软雅黑" w:hint="eastAsia"/>
                                 <w:color w:val="404040" w:themeColor="text1" w:themeTint="BF"/>
                               </w:rPr>
-                              <w:t>20</w:t>
+                              <w:t>2022</w:t>
                             </w:r>
                             <w:r>
                               <w:rPr>
                                 <w:rFonts w:ascii="微软雅黑" w:eastAsia="微软雅黑" w:hAnsi="微软雅黑"/>
                                 <w:color w:val="404040" w:themeColor="text1" w:themeTint="BF"/>
                               </w:rPr>
-                              <w:t>22.09</w:t>
+                              <w:t>Sep</w:t>
                             </w:r>
                             <w:r>
                               <w:rPr>
                                 <w:rFonts w:ascii="微软雅黑" w:eastAsia="微软雅黑" w:hAnsi="微软雅黑" w:hint="eastAsia"/>
                                 <w:color w:val="404040" w:themeColor="text1" w:themeTint="BF"/>
                               </w:rPr>
-                              <w:t>-</w:t>
+                              <w:t>–</w:t>
                             </w:r>
                             <w:r>
                               <w:rPr>
                                 <w:rFonts w:ascii="微软雅黑" w:eastAsia="微软雅黑" w:hAnsi="微软雅黑"/>
                                 <w:color w:val="404040" w:themeColor="text1" w:themeTint="BF"/>
                               </w:rPr>
-                              <w:t>2</w:t>
+                              <w:t>2022</w:t>
                             </w:r>
                             <w:r>
                               <w:rPr>
                                 <w:rFonts w:ascii="微软雅黑" w:eastAsia="微软雅黑" w:hAnsi="微软雅黑" w:hint="eastAsia"/>
                                 <w:color w:val="404040" w:themeColor="text1" w:themeTint="BF"/>
                               </w:rPr>
-                              <w:t>0</w:t>
+                              <w:t/>
                             </w:r>
                             <w:r>
                               <w:rPr>
                                 <w:rFonts w:ascii="微软雅黑" w:eastAsia="微软雅黑" w:hAnsi="微软雅黑"/>
                                 <w:color w:val="404040" w:themeColor="text1" w:themeTint="BF"/>
                               </w:rPr>
-                              <w:t xml:space="preserve">26.06          </w:t>
+                              <w:t xml:space="preserve">Jun 2026</w:t>
                             </w:r>
                             <w:r>
                               <w:rPr>
                                 <w:rFonts w:ascii="微软雅黑" w:eastAsia="微软雅黑" w:hAnsi="微软雅黑" w:hint="eastAsia"/>
                                 <w:color w:val="404040" w:themeColor="text1" w:themeTint="BF"/>
                               </w:rPr>
-                              <w:t xml:space="preserve">广东白云学院         </w:t>
+                              <w:t xml:space="preserve">Guangdong Baiyun University</w:t>
                             </w:r>
                             <w:r>
                               <w:rPr>
                                 <w:rFonts w:ascii="微软雅黑" w:eastAsia="微软雅黑" w:hAnsi="微软雅黑"/>
                                 <w:color w:val="404040" w:themeColor="text1" w:themeTint="BF"/>
                               </w:rPr>
-                              <w:t xml:space="preserve">            </w:t>
+                              <w:t xml:space="preserve"/>
                             </w:r>
                             <w:r>
                               <w:rPr>
                                 <w:rFonts w:ascii="微软雅黑" w:eastAsia="微软雅黑" w:hAnsi="微软雅黑" w:hint="eastAsia"/>
                                 <w:color w:val="404040" w:themeColor="text1" w:themeTint="BF"/>
                               </w:rPr>
-                              <w:t xml:space="preserve"> 数字经济（本科）</w:t>
+                              <w:t xml:space="preserve">Digital Economics (B.A.)</w:t>
                             </w:r>
                           </w:p>
                           <w:p>
@@ -2421,7 +2421,7 @@
                                 <w:sz w:val="20"/>
                                 <w:szCs w:val="20"/>
                               </w:rPr>
-                              <w:t>主修：Python数据分析、MySQL、SPSS、Power BI、Tableau、国际市场营销</w:t>
+                              <w:t>Coursework: Python Data Analysis, MySQL, SPSS, Power BI, Tableau, International Marketing</w:t>
                             </w:r>
                           </w:p>
                         </w:txbxContent>
@@ -2455,63 +2455,63 @@
                           <w:rFonts w:ascii="微软雅黑" w:eastAsia="微软雅黑" w:hAnsi="微软雅黑" w:hint="eastAsia"/>
                           <w:color w:val="404040" w:themeColor="text1" w:themeTint="BF"/>
                         </w:rPr>
-                        <w:t>20</w:t>
+                        <w:t>2022</w:t>
                       </w:r>
                       <w:r>
                         <w:rPr>
                           <w:rFonts w:ascii="微软雅黑" w:eastAsia="微软雅黑" w:hAnsi="微软雅黑"/>
                           <w:color w:val="404040" w:themeColor="text1" w:themeTint="BF"/>
                         </w:rPr>
-                        <w:t>22.09</w:t>
+                        <w:t>Sep</w:t>
                       </w:r>
                       <w:r>
                         <w:rPr>
                           <w:rFonts w:ascii="微软雅黑" w:eastAsia="微软雅黑" w:hAnsi="微软雅黑" w:hint="eastAsia"/>
                           <w:color w:val="404040" w:themeColor="text1" w:themeTint="BF"/>
                         </w:rPr>
-                        <w:t>-</w:t>
+                        <w:t>–</w:t>
                       </w:r>
                       <w:r>
                         <w:rPr>
                           <w:rFonts w:ascii="微软雅黑" w:eastAsia="微软雅黑" w:hAnsi="微软雅黑"/>
                           <w:color w:val="404040" w:themeColor="text1" w:themeTint="BF"/>
                         </w:rPr>
-                        <w:t>2</w:t>
+                        <w:t>2022</w:t>
                       </w:r>
                       <w:r>
                         <w:rPr>
                           <w:rFonts w:ascii="微软雅黑" w:eastAsia="微软雅黑" w:hAnsi="微软雅黑" w:hint="eastAsia"/>
                           <w:color w:val="404040" w:themeColor="text1" w:themeTint="BF"/>
                         </w:rPr>
-                        <w:t>0</w:t>
+                        <w:t/>
                       </w:r>
                       <w:r>
                         <w:rPr>
                           <w:rFonts w:ascii="微软雅黑" w:eastAsia="微软雅黑" w:hAnsi="微软雅黑"/>
                           <w:color w:val="404040" w:themeColor="text1" w:themeTint="BF"/>
                         </w:rPr>
-                        <w:t xml:space="preserve">26.06          </w:t>
+                        <w:t xml:space="preserve">Jun 2026</w:t>
                       </w:r>
                       <w:r>
                         <w:rPr>
                           <w:rFonts w:ascii="微软雅黑" w:eastAsia="微软雅黑" w:hAnsi="微软雅黑" w:hint="eastAsia"/>
                           <w:color w:val="404040" w:themeColor="text1" w:themeTint="BF"/>
                         </w:rPr>
-                        <w:t xml:space="preserve">广东白云学院         </w:t>
+                        <w:t xml:space="preserve">Guangdong Baiyun University</w:t>
                       </w:r>
                       <w:r>
                         <w:rPr>
                           <w:rFonts w:ascii="微软雅黑" w:eastAsia="微软雅黑" w:hAnsi="微软雅黑"/>
                           <w:color w:val="404040" w:themeColor="text1" w:themeTint="BF"/>
                         </w:rPr>
-                        <w:t xml:space="preserve">            </w:t>
+                        <w:t xml:space="preserve"/>
                       </w:r>
                       <w:r>
                         <w:rPr>
                           <w:rFonts w:ascii="微软雅黑" w:eastAsia="微软雅黑" w:hAnsi="微软雅黑" w:hint="eastAsia"/>
                           <w:color w:val="404040" w:themeColor="text1" w:themeTint="BF"/>
                         </w:rPr>
-                        <w:t xml:space="preserve"> 数字经济（本科）</w:t>
+                        <w:t xml:space="preserve">Digital Economics (B.A.)</w:t>
                       </w:r>
                     </w:p>
                     <w:p>
@@ -2530,7 +2530,7 @@
                           <w:sz w:val="20"/>
                           <w:szCs w:val="20"/>
                         </w:rPr>
-                        <w:t>主修：Python数据分析、MySQL、SPSS、Power BI、Tableau、国际市场营销</w:t>
+                        <w:t>Coursework: Python Data Analysis, MySQL, SPSS, Power BI, Tableau, International Marketing</w:t>
                       </w:r>
                     </w:p>
                   </w:txbxContent>
@@ -2707,7 +2707,7 @@
                                   <w:sz w:val="28"/>
                                   <w:szCs w:val="28"/>
                                 </w:rPr>
-                                <w:t>教育</w:t>
+                                <w:t>Education</w:t>
                               </w:r>
                               <w:r>
                                 <w:rPr>
@@ -2717,7 +2717,7 @@
                                   <w:sz w:val="28"/>
                                   <w:szCs w:val="28"/>
                                 </w:rPr>
-                                <w:t>背景</w:t>
+                                <w:t>Background</w:t>
                               </w:r>
                             </w:p>
                           </w:txbxContent>
@@ -2756,7 +2756,7 @@
                             <w:sz w:val="28"/>
                             <w:szCs w:val="28"/>
                           </w:rPr>
-                          <w:t>教育</w:t>
+                          <w:t>Education</w:t>
                         </w:r>
                         <w:r>
                           <w:rPr>
@@ -2766,7 +2766,7 @@
                             <w:sz w:val="28"/>
                             <w:szCs w:val="28"/>
                           </w:rPr>
-                          <w:t>背景</w:t>
+                          <w:t>Background</w:t>
                         </w:r>
                       </w:p>
                     </w:txbxContent>
@@ -2855,7 +2855,7 @@
                                 <w:sz w:val="24"/>
                                 <w:szCs w:val="24"/>
                               </w:rPr>
-                              <w:t>能把业务目标拆成可落地的AI流程与工具，兼顾数据、效率和商业结果，并为整个团队赋能</w:t>
+                              <w:t>Business-focused AI product builder targeting AI product, solutions and FDE roles with Shenzhen-based international teams; turns ambiguous operational problems into executable workflows, tools and measurable outcomes.</w:t>
                             </w:r>
                           </w:p>
                           <w:p>
@@ -2953,7 +2953,7 @@
                           <w:sz w:val="24"/>
                           <w:szCs w:val="24"/>
                         </w:rPr>
-                        <w:t>能把业务目标拆成可落地的AI流程与工具，兼顾数据、效率和商业结果，并为整个团队赋能</w:t>
+                        <w:t>Business-focused AI product builder targeting AI product, solutions and FDE roles with Shenzhen-based international teams; turns ambiguous operational problems into executable workflows, tools and measurable outcomes.</w:t>
                       </w:r>
                     </w:p>
                     <w:p>
@@ -3142,7 +3142,7 @@
                                 <w:rFonts w:ascii="微软雅黑" w:eastAsia="微软雅黑" w:hAnsi="微软雅黑"/>
                                 <w:color w:val="404040" w:themeColor="text1" w:themeTint="BF"/>
                               </w:rPr>
-                              <w:t>岁</w:t>
+                              <w:t>years</w:t>
                             </w:r>
                           </w:p>
                           <w:p>
@@ -3160,7 +3160,7 @@
                                 <w:rFonts w:ascii="微软雅黑" w:eastAsia="微软雅黑" w:hAnsi="微软雅黑" w:hint="eastAsia"/>
                                 <w:color w:val="404040" w:themeColor="text1" w:themeTint="BF"/>
                               </w:rPr>
-                              <w:t>群众</w:t>
+                              <w:t/>
                             </w:r>
                           </w:p>
                           <w:p>
@@ -3178,7 +3178,7 @@
                                 <w:rFonts w:ascii="微软雅黑" w:eastAsia="微软雅黑" w:hAnsi="微软雅黑" w:hint="eastAsia"/>
                                 <w:color w:val="404040" w:themeColor="text1" w:themeTint="BF"/>
                               </w:rPr>
-                              <w:t>广东白云学院</w:t>
+                              <w:t>Guangdong Baiyun University</w:t>
                             </w:r>
                           </w:p>
                           <w:p>
@@ -3196,7 +3196,7 @@
                                 <w:rFonts w:ascii="微软雅黑" w:eastAsia="微软雅黑" w:hAnsi="微软雅黑" w:hint="eastAsia"/>
                                 <w:color w:val="404040" w:themeColor="text1" w:themeTint="BF"/>
                               </w:rPr>
-                              <w:t>本科</w:t>
+                              <w:t>Bachelor's</w:t>
                             </w:r>
                           </w:p>
                         </w:txbxContent>
@@ -3237,7 +3237,7 @@
                           <w:rFonts w:ascii="微软雅黑" w:eastAsia="微软雅黑" w:hAnsi="微软雅黑"/>
                           <w:color w:val="404040" w:themeColor="text1" w:themeTint="BF"/>
                         </w:rPr>
-                        <w:t>岁</w:t>
+                        <w:t>years</w:t>
                       </w:r>
                     </w:p>
                     <w:p>
@@ -3255,7 +3255,7 @@
                           <w:rFonts w:ascii="微软雅黑" w:eastAsia="微软雅黑" w:hAnsi="微软雅黑" w:hint="eastAsia"/>
                           <w:color w:val="404040" w:themeColor="text1" w:themeTint="BF"/>
                         </w:rPr>
-                        <w:t>群众</w:t>
+                        <w:t/>
                       </w:r>
                     </w:p>
                     <w:p>
@@ -3273,7 +3273,7 @@
                           <w:rFonts w:ascii="微软雅黑" w:eastAsia="微软雅黑" w:hAnsi="微软雅黑" w:hint="eastAsia"/>
                           <w:color w:val="404040" w:themeColor="text1" w:themeTint="BF"/>
                         </w:rPr>
-                        <w:t>广东白云学院</w:t>
+                        <w:t>Guangdong Baiyun University</w:t>
                       </w:r>
                     </w:p>
                     <w:p>
@@ -3291,7 +3291,7 @@
                           <w:rFonts w:ascii="微软雅黑" w:eastAsia="微软雅黑" w:hAnsi="微软雅黑" w:hint="eastAsia"/>
                           <w:color w:val="404040" w:themeColor="text1" w:themeTint="BF"/>
                         </w:rPr>
-                        <w:t>本科</w:t>
+                        <w:t>Bachelor's</w:t>
                       </w:r>
                     </w:p>
                   </w:txbxContent>
@@ -3655,7 +3655,7 @@
                                   <w:sz w:val="28"/>
                                   <w:szCs w:val="28"/>
                                 </w:rPr>
-                                <w:t>核心数据</w:t>
+                                <w:t>Key metrics</w:t>
                               </w:r>
                             </w:p>
                           </w:txbxContent>
@@ -3694,7 +3694,7 @@
                             <w:sz w:val="28"/>
                             <w:szCs w:val="28"/>
                           </w:rPr>
-                          <w:t>核心数据</w:t>
+                          <w:t>Key metrics</w:t>
                         </w:r>
                       </w:p>
                     </w:txbxContent>
@@ -3779,7 +3779,7 @@
                                 <w:color w:val="404040" w:themeColor="text1" w:themeTint="BF"/>
                                 <w:szCs w:val="21"/>
                               </w:rPr>
-                              <w:t>2026-04</w:t>
+                              <w:t>Apr 2026</w:t>
                             </w:r>
                             <w:r>
                               <w:rPr>
@@ -3788,7 +3788,7 @@
                                 <w:color w:val="404040" w:themeColor="text1" w:themeTint="BF"/>
                                 <w:szCs w:val="21"/>
                               </w:rPr>
-                              <w:t>至2027-04｜深圳市坤信科技有限公司｜AI产品开发</w:t>
+                              <w:t>– Apr 2027 | Shenzhen Kunxin Technology Co., Ltd. | AI Product Development</w:t>
                             </w:r>
                           </w:p>
                           <w:p>
@@ -3813,7 +3813,7 @@
                                 <w:sz w:val="20"/>
                                 <w:szCs w:val="20"/>
                               </w:rPr>
-                              <w:t>• 负责AI产品开发与Amazon流程落地；每月精铺8个品以上，负责品月度利润贡献≥2万元且持续不亏损。</w:t>
+                              <w:t>• Owned AI workflow development for Amazon precision e-commerce; launched 8+ products monthly, with assigned products contributing &gt;= RMB 20K monthly gross profit while remaining profitable.</w:t>
                             </w:r>
                           </w:p>
                           <w:p>
@@ -3838,7 +3838,7 @@
                                 <w:sz w:val="20"/>
                                 <w:szCs w:val="20"/>
                               </w:rPr>
-                              <w:t>2025-09至2026-01｜冠仕医疗供应链有限公司｜采购</w:t>
+                              <w:t>Sep 2025 – Jan 2026 | Guanshi Medical Supply Chain Co., Ltd. | Procurement</w:t>
                             </w:r>
                           </w:p>
                           <w:p>
@@ -3863,7 +3863,7 @@
                                 <w:color w:val="404040" w:themeColor="text1" w:themeTint="BF"/>
                                 <w:szCs w:val="21"/>
                               </w:rPr>
-                              <w:t>• 负责找货、采购、发货、供应商议价；月均降本1-2万元，推动21家供应商进入ERP长期合作。</w:t>
+                              <w:t>• Managed sourcing, purchasing, shipping and supplier negotiation; reduced monthly costs by RMB 10K–20K and moved 21 suppliers into long-term ERP cooperation.</w:t>
                             </w:r>
                           </w:p>
                           <w:p>
@@ -3888,7 +3888,7 @@
                                 <w:sz w:val="20"/>
                                 <w:szCs w:val="20"/>
                               </w:rPr>
-                              <w:t>2023-07至09｜柔宇科技｜数据分析（实习生）</w:t>
+                              <w:t>Jul – Sep 2023 | Royole Technology | Data Analysis Intern</w:t>
                             </w:r>
                           </w:p>
                           <w:p>
@@ -3912,7 +3912,7 @@
                                 <w:sz w:val="20"/>
                                 <w:szCs w:val="20"/>
                               </w:rPr>
-                              <w:t>• 负责电商销售数据采集监控，使用Python爬取清洗并建立销售数据库；使用SPSS分析销售趋势、预测季度销量。</w:t>
+                              <w:t>• Collected and monitored e-commerce data, used Python for scraping and cleaning, built a sales database, and used SPSS for trend analysis and quarterly forecasting.</w:t>
                             </w:r>
                           </w:p>
                           <w:p>
@@ -3937,7 +3937,7 @@
                                 <w:color w:val="404040" w:themeColor="text1" w:themeTint="BF"/>
                                 <w:szCs w:val="21"/>
                               </w:rPr>
-                              <w:t>项目经历</w:t>
+                              <w:t>Selected projects</w:t>
                             </w:r>
                           </w:p>
                           <w:p>
@@ -3959,7 +3959,7 @@
                                 <w:color w:val="404040" w:themeColor="text1" w:themeTint="BF"/>
                                 <w:szCs w:val="21"/>
                               </w:rPr>
-                              <w:t>2026-04至2027-04｜AI选品与开品流程</w:t>
+                              <w:t>Apr 2026 – Apr 2027 | AI Product Selection &amp; Launch Workflow</w:t>
                             </w:r>
                           </w:p>
                           <w:p>
@@ -3983,7 +3983,7 @@
                                 <w:sz w:val="20"/>
                                 <w:szCs w:val="20"/>
                               </w:rPr>
-                              <w:t>• 结合飞书多维表格与多套选品逻辑，搭建从需求、竞品、关键词到利润判断和开品执行的全套流程。</w:t>
+                              <w:t>• Built an end-to-end workflow in Feishu Bitable covering demand intake, competitor research, keyword validation, profit assessment and launch execution.</w:t>
                             </w:r>
                           </w:p>
                           <w:p>
@@ -4008,7 +4008,7 @@
                                 <w:sz w:val="20"/>
                                 <w:szCs w:val="20"/>
                               </w:rPr>
-                              <w:t>• 结果：每月精铺8个品以上，开品速度约为同事2倍。</w:t>
+                              <w:t>• Result: 8+ precision launches/month at roughly 2x peer speed.</w:t>
                             </w:r>
                           </w:p>
                           <w:p>
@@ -4030,7 +4030,7 @@
                                 <w:color w:val="404040" w:themeColor="text1" w:themeTint="BF"/>
                                 <w:szCs w:val="21"/>
                               </w:rPr>
-                              <w:t>2026-04至2027-04｜AI做图提效：</w:t>
+                              <w:t>Apr 2026 – Apr 2027 | AI Creative Production: </w:t>
                             </w:r>
                             <w:proofErr w:type="spellStart"/>
                             <w:r>
@@ -4050,7 +4050,7 @@
                                 <w:color w:val="404040" w:themeColor="text1" w:themeTint="BF"/>
                                 <w:szCs w:val="21"/>
                               </w:rPr>
-                              <w:t>快速做图，30分钟/套，优化3名设计师。</w:t>
+                              <w:t> fast-image workflow, 30 min/set, optimizing the capacity of 3 designers.</w:t>
                             </w:r>
                           </w:p>
                           <w:p>
@@ -4088,7 +4088,7 @@
                                 <w:color w:val="404040" w:themeColor="text1" w:themeTint="BF"/>
                                 <w:szCs w:val="21"/>
                               </w:rPr>
-                              <w:t xml:space="preserve">   </w:t>
+                              <w:t xml:space="preserve"/>
                             </w:r>
                           </w:p>
                         </w:txbxContent>
@@ -4128,7 +4128,7 @@
                           <w:color w:val="404040" w:themeColor="text1" w:themeTint="BF"/>
                           <w:szCs w:val="21"/>
                         </w:rPr>
-                        <w:t>2026-04</w:t>
+                        <w:t>Apr 2026</w:t>
                       </w:r>
                       <w:r>
                         <w:rPr>
@@ -4137,7 +4137,7 @@
                           <w:color w:val="404040" w:themeColor="text1" w:themeTint="BF"/>
                           <w:szCs w:val="21"/>
                         </w:rPr>
-                        <w:t>至2027-04｜深圳市坤信科技有限公司｜AI产品开发</w:t>
+                        <w:t>– Apr 2027 | Shenzhen Kunxin Technology Co., Ltd. | AI Product Development</w:t>
                       </w:r>
                     </w:p>
                     <w:p>
@@ -4162,7 +4162,7 @@
                           <w:sz w:val="20"/>
                           <w:szCs w:val="20"/>
                         </w:rPr>
-                        <w:t>• 负责AI产品开发与Amazon流程落地；每月精铺8个品以上，负责品月度利润贡献≥2万元且持续不亏损。</w:t>
+                        <w:t>• Owned AI workflow development for Amazon precision e-commerce; launched 8+ products monthly, with assigned products contributing &gt;= RMB 20K monthly gross profit while remaining profitable.</w:t>
                       </w:r>
                     </w:p>
                     <w:p>
@@ -4187,7 +4187,7 @@
                           <w:sz w:val="20"/>
                           <w:szCs w:val="20"/>
                         </w:rPr>
-                        <w:t>2025-09至2026-01｜冠仕医疗供应链有限公司｜采购</w:t>
+                        <w:t>Sep 2025 – Jan 2026 | Guanshi Medical Supply Chain Co., Ltd. | Procurement</w:t>
                       </w:r>
                     </w:p>
                     <w:p>
@@ -4212,7 +4212,7 @@
                           <w:color w:val="404040" w:themeColor="text1" w:themeTint="BF"/>
                           <w:szCs w:val="21"/>
                         </w:rPr>
-                        <w:t>• 负责找货、采购、发货、供应商议价；月均降本1-2万元，推动21家供应商进入ERP长期合作。</w:t>
+                        <w:t>• Managed sourcing, purchasing, shipping and supplier negotiation; reduced monthly costs by RMB 10K–20K and moved 21 suppliers into long-term ERP cooperation.</w:t>
                       </w:r>
                     </w:p>
                     <w:p>
@@ -4237,7 +4237,7 @@
                           <w:sz w:val="20"/>
                           <w:szCs w:val="20"/>
                         </w:rPr>
-                        <w:t>2023-07至09｜柔宇科技｜数据分析（实习生）</w:t>
+                        <w:t>Jul – Sep 2023 | Royole Technology | Data Analysis Intern</w:t>
                       </w:r>
                     </w:p>
                     <w:p>
@@ -4261,7 +4261,7 @@
                           <w:sz w:val="20"/>
                           <w:szCs w:val="20"/>
                         </w:rPr>
-                        <w:t>• 负责电商销售数据采集监控，使用Python爬取清洗并建立销售数据库；使用SPSS分析销售趋势、预测季度销量。</w:t>
+                        <w:t>• Collected and monitored e-commerce data, used Python for scraping and cleaning, built a sales database, and used SPSS for trend analysis and quarterly forecasting.</w:t>
                       </w:r>
                     </w:p>
                     <w:p>
@@ -4286,7 +4286,7 @@
                           <w:color w:val="404040" w:themeColor="text1" w:themeTint="BF"/>
                           <w:szCs w:val="21"/>
                         </w:rPr>
-                        <w:t>项目经历</w:t>
+                        <w:t>Selected projects</w:t>
                       </w:r>
                     </w:p>
                     <w:p>
@@ -4308,7 +4308,7 @@
                           <w:color w:val="404040" w:themeColor="text1" w:themeTint="BF"/>
                           <w:szCs w:val="21"/>
                         </w:rPr>
-                        <w:t>2026-04至2027-04｜AI选品与开品流程</w:t>
+                        <w:t>Apr 2026 – Apr 2027 | AI Product Selection &amp; Launch Workflow</w:t>
                       </w:r>
                     </w:p>
                     <w:p>
@@ -4332,7 +4332,7 @@
                           <w:sz w:val="20"/>
                           <w:szCs w:val="20"/>
                         </w:rPr>
-                        <w:t>• 结合飞书多维表格与多套选品逻辑，搭建从需求、竞品、关键词到利润判断和开品执行的全套流程。</w:t>
+                        <w:t>• Built an end-to-end workflow in Feishu Bitable covering demand intake, competitor research, keyword validation, profit assessment and launch execution.</w:t>
                       </w:r>
                     </w:p>
                     <w:p>
@@ -4357,7 +4357,7 @@
                           <w:sz w:val="20"/>
                           <w:szCs w:val="20"/>
                         </w:rPr>
-                        <w:t>• 结果：每月精铺8个品以上，开品速度约为同事2倍。</w:t>
+                        <w:t>• Result: 8+ precision launches/month at roughly 2x peer speed.</w:t>
                       </w:r>
                     </w:p>
                     <w:p>
@@ -4379,7 +4379,7 @@
                           <w:color w:val="404040" w:themeColor="text1" w:themeTint="BF"/>
                           <w:szCs w:val="21"/>
                         </w:rPr>
-                        <w:t>2026-04至2027-04｜AI做图提效：</w:t>
+                        <w:t>Apr 2026 – Apr 2027 | AI Creative Production: </w:t>
                       </w:r>
                       <w:proofErr w:type="spellStart"/>
                       <w:r>
@@ -4399,7 +4399,7 @@
                           <w:color w:val="404040" w:themeColor="text1" w:themeTint="BF"/>
                           <w:szCs w:val="21"/>
                         </w:rPr>
-                        <w:t>快速做图，30分钟/套，优化3名设计师。</w:t>
+                        <w:t> fast-image workflow, 30 min/set, optimizing the capacity of 3 designers.</w:t>
                       </w:r>
                     </w:p>
                     <w:p>
@@ -4437,7 +4437,7 @@
                           <w:color w:val="404040" w:themeColor="text1" w:themeTint="BF"/>
                           <w:szCs w:val="21"/>
                         </w:rPr>
-                        <w:t xml:space="preserve">   </w:t>
+                        <w:t xml:space="preserve"/>
                       </w:r>
                     </w:p>
                   </w:txbxContent>
@@ -4614,7 +4614,7 @@
                                   <w:sz w:val="28"/>
                                   <w:szCs w:val="28"/>
                                 </w:rPr>
-                                <w:t>工作经历</w:t>
+                                <w:t>Professional experience</w:t>
                               </w:r>
                             </w:p>
                           </w:txbxContent>
@@ -4653,7 +4653,7 @@
                             <w:sz w:val="28"/>
                             <w:szCs w:val="28"/>
                           </w:rPr>
-                          <w:t>工作经历</w:t>
+                          <w:t>Professional experience</w:t>
                         </w:r>
                       </w:p>
                     </w:txbxContent>
@@ -4684,13 +4684,15 @@
           <w:sz w:val="30"/>
           <w:szCs w:val="30"/>
         </w:rPr>
-        <w:t>Kunxin Technology | AI Product Development Work Details</w:t>
+        <w:lastRenderedPageBreak/>
+        <w:t>Kunxin Technology | AI Product Development</w:t>
       </w:r>
     </w:p>
     <w:p>
       <w:pPr>
         <w:spacing w:after="150" w:line="260" w:lineRule="auto"/>
       </w:pPr>
+      <w:proofErr w:type="gramStart"/>
       <w:r>
         <w:rPr>
           <w:rFonts w:ascii="微软雅黑" w:eastAsia="微软雅黑" w:hAnsi="微软雅黑"/>
@@ -4698,7 +4700,37 @@
           <w:color w:val="404040"/>
           <w:szCs w:val="21"/>
         </w:rPr>
-        <w:t>Shenzhen Kunxin Technology Co., Ltd.  |  AI Product Development  |  Apr 2026 – Apr 2027</w:t>
+        <w:t>Shenzhen Kunxin Technology Co., Ltd. |</w:t>
+      </w:r>
+      <w:proofErr w:type="gramEnd"/>
+      <w:r>
+        <w:rPr>
+          <w:rFonts w:ascii="微软雅黑" w:eastAsia="微软雅黑" w:hAnsi="微软雅黑"/>
+          <w:b/>
+          <w:color w:val="404040"/>
+          <w:szCs w:val="21"/>
+        </w:rPr>
+        <w:t xml:space="preserve"> AI</w:t>
+      </w:r>
+      <w:proofErr w:type="gramStart"/>
+      <w:r>
+        <w:rPr>
+          <w:rFonts w:ascii="微软雅黑" w:eastAsia="微软雅黑" w:hAnsi="微软雅黑"/>
+          <w:b/>
+          <w:color w:val="404040"/>
+          <w:szCs w:val="21"/>
+        </w:rPr>
+        <w:t> Product Development |</w:t>
+      </w:r>
+      <w:proofErr w:type="gramEnd"/>
+      <w:r>
+        <w:rPr>
+          <w:rFonts w:ascii="微软雅黑" w:eastAsia="微软雅黑" w:hAnsi="微软雅黑"/>
+          <w:b/>
+          <w:color w:val="404040"/>
+          <w:szCs w:val="21"/>
+        </w:rPr>
+        <w:t xml:space="preserve"> Apr 2026 – Apr 2027</w:t>
       </w:r>
     </w:p>
     <w:p>
@@ -4717,7 +4749,7 @@
           <w:sz w:val="23"/>
           <w:szCs w:val="23"/>
         </w:rPr>
-        <w:t>1. Product Selection and Launch Workflow Design</w:t>
+        <w:t>1. AI Product Selection &amp; Launch Workflow</w:t>
       </w:r>
     </w:p>
     <w:p>
@@ -4732,17 +4764,16 @@
           <w:sz w:val="20"/>
           <w:szCs w:val="20"/>
         </w:rPr>
-        <w:t xml:space="preserve">Business challenge: </w:t>
+        <w:t>Business challenge:</w:t>
       </w:r>
       <w:r>
         <w:rPr>
           <w:rFonts w:ascii="微软雅黑" w:eastAsia="微软雅黑" w:hAnsi="微软雅黑"/>
-          <w:b w:val="0"/>
           <w:color w:val="404040"/>
           <w:sz w:val="20"/>
           <w:szCs w:val="20"/>
         </w:rPr>
-        <w:t>Rebuilt the workflow from opportunity discovery to product launch to address fragmented product-selection decisions, hard-to-track information, and reliance on individual experience.</w:t>
+        <w:t> Rebuilt the workflow from opportunity discovery to product launch to address fragmented decisions, hard-to-track information and reliance on individual experience.</w:t>
       </w:r>
     </w:p>
     <w:p>
@@ -4757,17 +4788,16 @@
           <w:sz w:val="20"/>
           <w:szCs w:val="20"/>
         </w:rPr>
-        <w:t xml:space="preserve">Workflow build: </w:t>
+        <w:t>Workflow architecture:</w:t>
       </w:r>
       <w:r>
         <w:rPr>
           <w:rFonts w:ascii="微软雅黑" w:eastAsia="微软雅黑" w:hAnsi="微软雅黑"/>
-          <w:b w:val="0"/>
           <w:color w:val="404040"/>
           <w:sz w:val="20"/>
           <w:szCs w:val="20"/>
         </w:rPr>
-        <w:t>Used Feishu Bitable as the business hub, designing fields and checkpoints for demand intake, competitor analysis, keyword validation, profit modeling, supply-chain verification, decision records, launch tasks, and result tracking.</w:t>
+        <w:t> Designed Feishu Bitable fields and checkpoints for demand intake, competitor analysis, keyword validation, profit modeling, supply-chain checks, decision records, launch tasks and result tracking.</w:t>
       </w:r>
     </w:p>
     <w:p>
@@ -4782,17 +4812,16 @@
           <w:sz w:val="20"/>
           <w:szCs w:val="20"/>
         </w:rPr>
-        <w:t xml:space="preserve">Logic systemization: </w:t>
+        <w:t>Logic systemization:</w:t>
       </w:r>
       <w:r>
         <w:rPr>
           <w:rFonts w:ascii="微软雅黑" w:eastAsia="微软雅黑" w:hAnsi="微软雅黑"/>
-          <w:b w:val="0"/>
           <w:color w:val="404040"/>
           <w:sz w:val="20"/>
           <w:szCs w:val="20"/>
         </w:rPr>
-        <w:t>Converted multiple selection heuristics into a consistent decision sequence and reusable checklist, enabling continuous tracking of conclusions, evidence, supplier information, and follow-up tasks.</w:t>
+        <w:t> Converted multiple selection heuristics into a consistent decision sequence and reusable checklist, keeping conclusions, evidence, supplier information and follow-up tasks traceable.</w:t>
       </w:r>
     </w:p>
     <w:p>
@@ -4807,17 +4836,16 @@
           <w:sz w:val="20"/>
           <w:szCs w:val="20"/>
         </w:rPr>
-        <w:t xml:space="preserve">Collaboration model: </w:t>
+        <w:t>Cross-functional delivery:</w:t>
       </w:r>
       <w:r>
         <w:rPr>
           <w:rFonts w:ascii="微软雅黑" w:eastAsia="微软雅黑" w:hAnsi="微软雅黑"/>
-          <w:b w:val="0"/>
           <w:color w:val="404040"/>
           <w:sz w:val="20"/>
           <w:szCs w:val="20"/>
         </w:rPr>
-        <w:t>Connected product selection, procurement, creative production, Listing content, and profit tracking to reduce repetitive information handling and support shared execution standards for precision e-commerce projects.</w:t>
+        <w:t> Connected product selection, procurement, creative production, Listing content and profit tracking to reduce repeated information handling and support shared execution standards.</w:t>
       </w:r>
     </w:p>
     <w:p>
@@ -4836,7 +4864,7 @@
           <w:sz w:val="23"/>
           <w:szCs w:val="23"/>
         </w:rPr>
-        <w:t>2. AI-Enabled Creative Production Efficiency</w:t>
+        <w:t>2. AI Creative Production Workflow</w:t>
       </w:r>
     </w:p>
     <w:p>
@@ -4851,17 +4879,36 @@
           <w:sz w:val="20"/>
           <w:szCs w:val="20"/>
         </w:rPr>
-        <w:t xml:space="preserve">Solution research: </w:t>
+        <w:t>Approach:</w:t>
       </w:r>
       <w:r>
         <w:rPr>
           <w:rFonts w:ascii="微软雅黑" w:eastAsia="微软雅黑" w:hAnsi="微软雅黑"/>
-          <w:b w:val="0"/>
           <w:color w:val="404040"/>
           <w:sz w:val="20"/>
           <w:szCs w:val="20"/>
         </w:rPr>
-        <w:t>Combined LinkFox and related tools to study rapid product-image production, breaking down asset preparation, value-proposition extraction, prompts, visual requirements, generation review, dimension checks, and delivery archiving.</w:t>
+        <w:t>Combined </w:t>
+      </w:r>
+      <w:proofErr w:type="spellStart"/>
+      <w:r>
+        <w:rPr>
+          <w:rFonts w:ascii="微软雅黑" w:eastAsia="微软雅黑" w:hAnsi="微软雅黑"/>
+          <w:color w:val="404040"/>
+          <w:sz w:val="20"/>
+          <w:szCs w:val="20"/>
+        </w:rPr>
+        <w:t>LinkFox</w:t>
+      </w:r>
+      <w:proofErr w:type="spellEnd"/>
+      <w:r>
+        <w:rPr>
+          <w:rFonts w:ascii="微软雅黑" w:eastAsia="微软雅黑" w:hAnsi="微软雅黑"/>
+          <w:color w:val="404040"/>
+          <w:sz w:val="20"/>
+          <w:szCs w:val="20"/>
+        </w:rPr>
+        <w:t> and related tools to research rapid product-image production, from asset preparation and value-proposition extraction to prompt design, visual QA and delivery archiving.</w:t>
       </w:r>
     </w:p>
     <w:p>
@@ -4876,17 +4923,16 @@
           <w:sz w:val="20"/>
           <w:szCs w:val="20"/>
         </w:rPr>
-        <w:t xml:space="preserve">Process standardization: </w:t>
+        <w:t>Standardization:</w:t>
       </w:r>
       <w:r>
         <w:rPr>
           <w:rFonts w:ascii="微软雅黑" w:eastAsia="微软雅黑" w:hAnsi="微软雅黑"/>
-          <w:b w:val="0"/>
           <w:color w:val="404040"/>
           <w:sz w:val="20"/>
           <w:szCs w:val="20"/>
         </w:rPr>
-        <w:t>Created reusable image templates, asset checklists, and delivery QA items so different products could complete image sets against a consistent standard and reduce repeated communication.</w:t>
+        <w:t> Created reusable image templates, asset checklists and delivery QA items so different products could be completed against one consistent standard.</w:t>
       </w:r>
     </w:p>
     <w:p>
@@ -4901,17 +4947,16 @@
           <w:sz w:val="20"/>
           <w:szCs w:val="20"/>
         </w:rPr>
-        <w:t xml:space="preserve">Team value: </w:t>
+        <w:t>Team impact:</w:t>
       </w:r>
       <w:r>
         <w:rPr>
           <w:rFonts w:ascii="微软雅黑" w:eastAsia="微软雅黑" w:hAnsi="微软雅黑"/>
-          <w:b w:val="0"/>
           <w:color w:val="404040"/>
           <w:sz w:val="20"/>
           <w:szCs w:val="20"/>
         </w:rPr>
-        <w:t>Broke an experience-dependent design task into clear ownership and delivery checkpoints, improving design-resource utilization and laying the groundwork for scaled content production.</w:t>
+        <w:t> Defined ownership and delivery checkpoints for an experience-dependent design task, improving design-resource utilization and enabling scaled content production.</w:t>
       </w:r>
     </w:p>
     <w:p>
@@ -4930,7 +4975,7 @@
           <w:sz w:val="23"/>
           <w:szCs w:val="23"/>
         </w:rPr>
-        <w:t>3. AI Product Development and Business Delivery</w:t>
+        <w:t>3. Product Thinking &amp; Delivery</w:t>
       </w:r>
     </w:p>
     <w:p>
@@ -4945,17 +4990,16 @@
           <w:sz w:val="20"/>
           <w:szCs w:val="20"/>
         </w:rPr>
-        <w:t xml:space="preserve">Requirement breakdown: </w:t>
+        <w:t>Requirement framing:</w:t>
       </w:r>
       <w:r>
         <w:rPr>
           <w:rFonts w:ascii="微软雅黑" w:eastAsia="微软雅黑" w:hAnsi="微软雅黑"/>
-          <w:b w:val="0"/>
           <w:color w:val="404040"/>
           <w:sz w:val="20"/>
           <w:szCs w:val="20"/>
         </w:rPr>
-        <w:t>Break business goals into fields, workflows, tools, deliverables, and acceptance criteria, prioritizing the constraints that affect efficiency and profit.</w:t>
+        <w:t> Translated business goals into fields, workflows, tools, deliverables and acceptance criteria, prioritizing constraints that affect efficiency and profit.</w:t>
       </w:r>
     </w:p>
     <w:p>
@@ -4970,17 +5014,56 @@
           <w:sz w:val="20"/>
           <w:szCs w:val="20"/>
         </w:rPr>
-        <w:t xml:space="preserve">Tool implementation: </w:t>
+        <w:t>Tool stack:</w:t>
       </w:r>
       <w:r>
         <w:rPr>
           <w:rFonts w:ascii="微软雅黑" w:eastAsia="微软雅黑" w:hAnsi="微软雅黑"/>
-          <w:b w:val="0"/>
           <w:color w:val="404040"/>
           <w:sz w:val="20"/>
           <w:szCs w:val="20"/>
         </w:rPr>
-        <w:t>Use Feishu Bitable, SellerSprite, LinkFox, and AI-assisted coding to combine tools into executable, reviewable workflows.</w:t>
+        <w:t>Used Feishu Bitable, </w:t>
+      </w:r>
+      <w:proofErr w:type="spellStart"/>
+      <w:r>
+        <w:rPr>
+          <w:rFonts w:ascii="微软雅黑" w:eastAsia="微软雅黑" w:hAnsi="微软雅黑"/>
+          <w:color w:val="404040"/>
+          <w:sz w:val="20"/>
+          <w:szCs w:val="20"/>
+        </w:rPr>
+        <w:t>SellerSprite</w:t>
+      </w:r>
+      <w:proofErr w:type="spellEnd"/>
+      <w:r>
+        <w:rPr>
+          <w:rFonts w:ascii="微软雅黑" w:eastAsia="微软雅黑" w:hAnsi="微软雅黑"/>
+          <w:color w:val="404040"/>
+          <w:sz w:val="20"/>
+          <w:szCs w:val="20"/>
+        </w:rPr>
+        <w:t> and </w:t>
+      </w:r>
+      <w:proofErr w:type="spellStart"/>
+      <w:r>
+        <w:rPr>
+          <w:rFonts w:ascii="微软雅黑" w:eastAsia="微软雅黑" w:hAnsi="微软雅黑"/>
+          <w:color w:val="404040"/>
+          <w:sz w:val="20"/>
+          <w:szCs w:val="20"/>
+        </w:rPr>
+        <w:t>LinkFox</w:t>
+      </w:r>
+      <w:proofErr w:type="spellEnd"/>
+      <w:r>
+        <w:rPr>
+          <w:rFonts w:ascii="微软雅黑" w:eastAsia="微软雅黑" w:hAnsi="微软雅黑"/>
+          <w:color w:val="404040"/>
+          <w:sz w:val="20"/>
+          <w:szCs w:val="20"/>
+        </w:rPr>
+        <w:t> and AI-assisted coding to combine tools into executable, reviewable workflows.</w:t>
       </w:r>
     </w:p>
     <w:p>
@@ -4995,17 +5078,16 @@
           <w:sz w:val="20"/>
           <w:szCs w:val="20"/>
         </w:rPr>
-        <w:t xml:space="preserve">Outcome focus: </w:t>
+        <w:t>Outcome focus:</w:t>
       </w:r>
       <w:r>
         <w:rPr>
           <w:rFonts w:ascii="微软雅黑" w:eastAsia="微软雅黑" w:hAnsi="微软雅黑"/>
-          <w:b w:val="0"/>
           <w:color w:val="404040"/>
           <w:sz w:val="20"/>
           <w:szCs w:val="20"/>
         </w:rPr>
-        <w:t>Track adoption, delivery quality, collaboration, and results after launch, continuously improving instead of stopping at tool experimentation.</w:t>
+        <w:t> Tracked adoption, delivery quality, collaboration and business results after launch, iterating beyond the prototype stage.</w:t>
       </w:r>
     </w:p>
     <w:p>
@@ -5024,7 +5106,7 @@
           <w:sz w:val="23"/>
           <w:szCs w:val="23"/>
         </w:rPr>
-        <w:t>4. Previous Project Experience</w:t>
+        <w:t>4. Selected Cross-Border Projects</w:t>
       </w:r>
     </w:p>
     <w:p>
@@ -5039,7 +5121,29 @@
           <w:sz w:val="20"/>
           <w:szCs w:val="20"/>
         </w:rPr>
-        <w:t>Sep 2023 – Feb 2024  |  Mobile Phone Price-Adjustment Recovery Project</w:t>
+        <w:t>Sep 2023 – Feb 2024 |</w:t>
+      </w:r>
+      <w:proofErr w:type="gramStart"/>
+      <w:r>
+        <w:rPr>
+          <w:rFonts w:ascii="微软雅黑" w:eastAsia="微软雅黑" w:hAnsi="微软雅黑"/>
+          <w:b/>
+          <w:color w:val="404040"/>
+          <w:sz w:val="20"/>
+          <w:szCs w:val="20"/>
+        </w:rPr>
+        <w:t/>
+      </w:r>
+      <w:proofErr w:type="gramEnd"/>
+      <w:r>
+        <w:rPr>
+          <w:rFonts w:ascii="微软雅黑" w:eastAsia="微软雅黑" w:hAnsi="微软雅黑"/>
+          <w:b/>
+          <w:color w:val="404040"/>
+          <w:sz w:val="20"/>
+          <w:szCs w:val="20"/>
+        </w:rPr>
+        <w:t xml:space="preserve">Apple Price-Adjustment &amp; Cost-Preservation Project</w:t>
       </w:r>
     </w:p>
     <w:p>
@@ -5054,17 +5158,16 @@
           <w:sz w:val="20"/>
           <w:szCs w:val="20"/>
         </w:rPr>
-        <w:t xml:space="preserve">Project details: </w:t>
+        <w:t>Project scope:</w:t>
       </w:r>
       <w:r>
         <w:rPr>
           <w:rFonts w:ascii="微软雅黑" w:eastAsia="微软雅黑" w:hAnsi="微软雅黑"/>
-          <w:b w:val="0"/>
           <w:color w:val="404040"/>
           <w:sz w:val="20"/>
           <w:szCs w:val="20"/>
         </w:rPr>
-        <w:t>Handled Japanese communication with Apple customer support, coordinated each recovery case, tracked progress, and reconciled results; completed several hundred cases at approximately JPY 15,000 per case, generating nearly JPY 2 million in cumulative net profit.</w:t>
+        <w:t> Used Japanese to handle several hundred conversations with Apple customer support under official after-sales and price-adjustment policies, coordinating cases and preserving nearly JPY 2M in procurement cost.</w:t>
       </w:r>
     </w:p>
     <w:p>
@@ -5079,7 +5182,29 @@
           <w:sz w:val="20"/>
           <w:szCs w:val="20"/>
         </w:rPr>
-        <w:t>Mar – Jul 2025  |  Cross-Border Resale between China and Japan</w:t>
+        <w:t>Mar – Jul 2025 |</w:t>
+      </w:r>
+      <w:proofErr w:type="gramStart"/>
+      <w:r>
+        <w:rPr>
+          <w:rFonts w:ascii="微软雅黑" w:eastAsia="微软雅黑" w:hAnsi="微软雅黑"/>
+          <w:b/>
+          <w:color w:val="404040"/>
+          <w:sz w:val="20"/>
+          <w:szCs w:val="20"/>
+        </w:rPr>
+        <w:t/>
+      </w:r>
+      <w:proofErr w:type="gramEnd"/>
+      <w:r>
+        <w:rPr>
+          <w:rFonts w:ascii="微软雅黑" w:eastAsia="微软雅黑" w:hAnsi="微软雅黑"/>
+          <w:b/>
+          <w:color w:val="404040"/>
+          <w:sz w:val="20"/>
+          <w:szCs w:val="20"/>
+        </w:rPr>
+        <w:t xml:space="preserve">China–Japan Cross-Border Resale</w:t>
       </w:r>
     </w:p>
     <w:p>
@@ -5094,17 +5219,16 @@
           <w:sz w:val="20"/>
           <w:szCs w:val="20"/>
         </w:rPr>
-        <w:t xml:space="preserve">Project details: </w:t>
+        <w:t>Project scope:</w:t>
       </w:r>
       <w:r>
         <w:rPr>
           <w:rFonts w:ascii="微软雅黑" w:eastAsia="微软雅黑" w:hAnsi="微软雅黑"/>
-          <w:b w:val="0"/>
           <w:color w:val="404040"/>
           <w:sz w:val="20"/>
           <w:szCs w:val="20"/>
         </w:rPr>
-        <w:t>Traveled to Japan and worked with cross-border logistics on high-price-difference product resale, contributing to sourcing judgment, purchasing coordination, transportation, and sales execution.</w:t>
+        <w:t> Worked across sourcing judgment, purchasing coordination, cross-border logistics and sales execution for China–Japan price-difference products.</w:t>
       </w:r>
     </w:p>
     <w:p>
@@ -5123,7 +5247,7 @@
           <w:sz w:val="23"/>
           <w:szCs w:val="23"/>
         </w:rPr>
-        <w:t>5. Transferable Working Methods</w:t>
+        <w:t>5. Transferable Strengths</w:t>
       </w:r>
     </w:p>
     <w:p>
@@ -5138,17 +5262,16 @@
           <w:sz w:val="20"/>
           <w:szCs w:val="20"/>
         </w:rPr>
-        <w:t xml:space="preserve">Productize processes: </w:t>
+        <w:t>Productize workflows:</w:t>
       </w:r>
       <w:r>
         <w:rPr>
           <w:rFonts w:ascii="微软雅黑" w:eastAsia="微软雅黑" w:hAnsi="微软雅黑"/>
-          <w:b w:val="0"/>
           <w:color w:val="404040"/>
           <w:sz w:val="20"/>
           <w:szCs w:val="20"/>
         </w:rPr>
-        <w:t>Turn one-off experience into fields, rules, templates, and checklists that the team can use directly.</w:t>
+        <w:t> Turn one-off experience into fields, rules, templates and checklists that teams can use directly.</w:t>
       </w:r>
     </w:p>
     <w:p>
@@ -5163,17 +5286,16 @@
           <w:sz w:val="20"/>
           <w:szCs w:val="20"/>
         </w:rPr>
-        <w:t xml:space="preserve">Engineer efficiency: </w:t>
+        <w:t>Engineer efficiency:</w:t>
       </w:r>
       <w:r>
         <w:rPr>
           <w:rFonts w:ascii="微软雅黑" w:eastAsia="微软雅黑" w:hAnsi="微软雅黑"/>
-          <w:b w:val="0"/>
           <w:color w:val="404040"/>
           <w:sz w:val="20"/>
           <w:szCs w:val="20"/>
         </w:rPr>
-        <w:t>Identify high-frequency, repetitive, judgment-heavy steps, then use AI and tools for standardization, batching, and quality assurance.</w:t>
+        <w:t> Identify repetitive, judgment-heavy steps, then use AI and tools for standardization, batching and quality assurance.</w:t>
       </w:r>
     </w:p>
     <w:p>
@@ -5188,17 +5310,16 @@
           <w:sz w:val="20"/>
           <w:szCs w:val="20"/>
         </w:rPr>
-        <w:t xml:space="preserve">Make outcomes testable: </w:t>
+        <w:t>Make outcomes testable:</w:t>
       </w:r>
       <w:r>
         <w:rPr>
           <w:rFonts w:ascii="微软雅黑" w:eastAsia="微软雅黑" w:hAnsi="微软雅黑"/>
-          <w:b w:val="0"/>
           <w:color w:val="404040"/>
           <w:sz w:val="20"/>
           <w:szCs w:val="20"/>
         </w:rPr>
-        <w:t>Use adoption, delivery quality, and collaboration as acceptance criteria, then iterate from observed results.</w:t>
+        <w:t> Use adoption, delivery quality, collaboration and business results as acceptance criteria, then iterate from observed evidence.</w:t>
       </w:r>
     </w:p>
     <w:sectPr>

</xml_diff>